<commit_message>
UPdate train AI and create UI testing AI decision
</commit_message>
<xml_diff>
--- a/All_infomation_by_NTAnh.docx
+++ b/All_infomation_by_NTAnh.docx
@@ -1358,18 +1358,427 @@
         <w:t>Huấn luyện mô hình học máy (Machine Learning</w:t>
       </w:r>
     </w:p>
-    <w:p/>
-    <w:p>
-      <w:r>
-        <w:t>( Chưa code cho mấy cái trên nên hiện tại t.a sẽ lo code này ổn, sau đó mới qua này)</w:t>
-      </w:r>
-    </w:p>
-    <w:p>
-      <w:r>
-        <w:t xml:space="preserve">Chi tiết thì đêm nay xong t.a thiết kế pptx r gửi nha </w:t>
-      </w:r>
-    </w:p>
-    <w:p/>
+    <w:p>
+      <w:pPr>
+        <w:jc w:val="center"/>
+      </w:pPr>
+      <w:r>
+        <w:drawing>
+          <wp:inline distT="0" distB="0" distL="0" distR="0" wp14:anchorId="0BC6C632" wp14:editId="63AE19A5">
+            <wp:extent cx="4633362" cy="1356478"/>
+            <wp:effectExtent l="0" t="0" r="0" b="0"/>
+            <wp:docPr id="885099593" name="Picture 1"/>
+            <wp:cNvGraphicFramePr>
+              <a:graphicFrameLocks xmlns:a="http://schemas.openxmlformats.org/drawingml/2006/main" noChangeAspect="1"/>
+            </wp:cNvGraphicFramePr>
+            <a:graphic xmlns:a="http://schemas.openxmlformats.org/drawingml/2006/main">
+              <a:graphicData uri="http://schemas.openxmlformats.org/drawingml/2006/picture">
+                <pic:pic xmlns:pic="http://schemas.openxmlformats.org/drawingml/2006/picture">
+                  <pic:nvPicPr>
+                    <pic:cNvPr id="885099593" name=""/>
+                    <pic:cNvPicPr/>
+                  </pic:nvPicPr>
+                  <pic:blipFill>
+                    <a:blip r:embed="rId29"/>
+                    <a:stretch>
+                      <a:fillRect/>
+                    </a:stretch>
+                  </pic:blipFill>
+                  <pic:spPr>
+                    <a:xfrm>
+                      <a:off x="0" y="0"/>
+                      <a:ext cx="4633362" cy="1356478"/>
+                    </a:xfrm>
+                    <a:prstGeom prst="rect">
+                      <a:avLst/>
+                    </a:prstGeom>
+                  </pic:spPr>
+                </pic:pic>
+              </a:graphicData>
+            </a:graphic>
+          </wp:inline>
+        </w:drawing>
+      </w:r>
+    </w:p>
+    <w:p>
+      <w:pPr>
+        <w:jc w:val="center"/>
+      </w:pPr>
+    </w:p>
+    <w:p>
+      <w:pPr>
+        <w:jc w:val="center"/>
+      </w:pPr>
+      <w:r>
+        <w:lastRenderedPageBreak/>
+        <w:drawing>
+          <wp:inline distT="0" distB="0" distL="0" distR="0" wp14:anchorId="47B3672A" wp14:editId="4889A29B">
+            <wp:extent cx="5273497" cy="4061812"/>
+            <wp:effectExtent l="0" t="0" r="3810" b="0"/>
+            <wp:docPr id="6928274" name="Picture 1"/>
+            <wp:cNvGraphicFramePr>
+              <a:graphicFrameLocks xmlns:a="http://schemas.openxmlformats.org/drawingml/2006/main" noChangeAspect="1"/>
+            </wp:cNvGraphicFramePr>
+            <a:graphic xmlns:a="http://schemas.openxmlformats.org/drawingml/2006/main">
+              <a:graphicData uri="http://schemas.openxmlformats.org/drawingml/2006/picture">
+                <pic:pic xmlns:pic="http://schemas.openxmlformats.org/drawingml/2006/picture">
+                  <pic:nvPicPr>
+                    <pic:cNvPr id="6928274" name=""/>
+                    <pic:cNvPicPr/>
+                  </pic:nvPicPr>
+                  <pic:blipFill>
+                    <a:blip r:embed="rId30"/>
+                    <a:stretch>
+                      <a:fillRect/>
+                    </a:stretch>
+                  </pic:blipFill>
+                  <pic:spPr>
+                    <a:xfrm>
+                      <a:off x="0" y="0"/>
+                      <a:ext cx="5273497" cy="4061812"/>
+                    </a:xfrm>
+                    <a:prstGeom prst="rect">
+                      <a:avLst/>
+                    </a:prstGeom>
+                  </pic:spPr>
+                </pic:pic>
+              </a:graphicData>
+            </a:graphic>
+          </wp:inline>
+        </w:drawing>
+      </w:r>
+    </w:p>
+    <w:p>
+      <w:pPr>
+        <w:jc w:val="center"/>
+      </w:pPr>
+      <w:r>
+        <w:drawing>
+          <wp:inline distT="0" distB="0" distL="0" distR="0" wp14:anchorId="6A9E5176" wp14:editId="56A80EA8">
+            <wp:extent cx="5182049" cy="2423370"/>
+            <wp:effectExtent l="0" t="0" r="0" b="0"/>
+            <wp:docPr id="1488531594" name="Picture 1"/>
+            <wp:cNvGraphicFramePr>
+              <a:graphicFrameLocks xmlns:a="http://schemas.openxmlformats.org/drawingml/2006/main" noChangeAspect="1"/>
+            </wp:cNvGraphicFramePr>
+            <a:graphic xmlns:a="http://schemas.openxmlformats.org/drawingml/2006/main">
+              <a:graphicData uri="http://schemas.openxmlformats.org/drawingml/2006/picture">
+                <pic:pic xmlns:pic="http://schemas.openxmlformats.org/drawingml/2006/picture">
+                  <pic:nvPicPr>
+                    <pic:cNvPr id="1488531594" name=""/>
+                    <pic:cNvPicPr/>
+                  </pic:nvPicPr>
+                  <pic:blipFill>
+                    <a:blip r:embed="rId31"/>
+                    <a:stretch>
+                      <a:fillRect/>
+                    </a:stretch>
+                  </pic:blipFill>
+                  <pic:spPr>
+                    <a:xfrm>
+                      <a:off x="0" y="0"/>
+                      <a:ext cx="5182049" cy="2423370"/>
+                    </a:xfrm>
+                    <a:prstGeom prst="rect">
+                      <a:avLst/>
+                    </a:prstGeom>
+                  </pic:spPr>
+                </pic:pic>
+              </a:graphicData>
+            </a:graphic>
+          </wp:inline>
+        </w:drawing>
+      </w:r>
+    </w:p>
+    <w:p>
+      <w:pPr>
+        <w:jc w:val="center"/>
+      </w:pPr>
+    </w:p>
+    <w:p>
+      <w:pPr>
+        <w:jc w:val="center"/>
+      </w:pPr>
+      <w:r>
+        <w:drawing>
+          <wp:inline distT="0" distB="0" distL="0" distR="0" wp14:anchorId="11141F3C" wp14:editId="4BFEF2C6">
+            <wp:extent cx="5014395" cy="2110923"/>
+            <wp:effectExtent l="0" t="0" r="0" b="3810"/>
+            <wp:docPr id="1607067029" name="Picture 1"/>
+            <wp:cNvGraphicFramePr>
+              <a:graphicFrameLocks xmlns:a="http://schemas.openxmlformats.org/drawingml/2006/main" noChangeAspect="1"/>
+            </wp:cNvGraphicFramePr>
+            <a:graphic xmlns:a="http://schemas.openxmlformats.org/drawingml/2006/main">
+              <a:graphicData uri="http://schemas.openxmlformats.org/drawingml/2006/picture">
+                <pic:pic xmlns:pic="http://schemas.openxmlformats.org/drawingml/2006/picture">
+                  <pic:nvPicPr>
+                    <pic:cNvPr id="1607067029" name=""/>
+                    <pic:cNvPicPr/>
+                  </pic:nvPicPr>
+                  <pic:blipFill>
+                    <a:blip r:embed="rId32"/>
+                    <a:stretch>
+                      <a:fillRect/>
+                    </a:stretch>
+                  </pic:blipFill>
+                  <pic:spPr>
+                    <a:xfrm>
+                      <a:off x="0" y="0"/>
+                      <a:ext cx="5014395" cy="2110923"/>
+                    </a:xfrm>
+                    <a:prstGeom prst="rect">
+                      <a:avLst/>
+                    </a:prstGeom>
+                  </pic:spPr>
+                </pic:pic>
+              </a:graphicData>
+            </a:graphic>
+          </wp:inline>
+        </w:drawing>
+      </w:r>
+    </w:p>
+    <w:p>
+      <w:pPr>
+        <w:jc w:val="center"/>
+      </w:pPr>
+      <w:r>
+        <w:lastRenderedPageBreak/>
+        <w:drawing>
+          <wp:inline distT="0" distB="0" distL="0" distR="0" wp14:anchorId="1AE2A82A" wp14:editId="045A1EF0">
+            <wp:extent cx="4976291" cy="3703641"/>
+            <wp:effectExtent l="0" t="0" r="0" b="0"/>
+            <wp:docPr id="887771258" name="Picture 1"/>
+            <wp:cNvGraphicFramePr>
+              <a:graphicFrameLocks xmlns:a="http://schemas.openxmlformats.org/drawingml/2006/main" noChangeAspect="1"/>
+            </wp:cNvGraphicFramePr>
+            <a:graphic xmlns:a="http://schemas.openxmlformats.org/drawingml/2006/main">
+              <a:graphicData uri="http://schemas.openxmlformats.org/drawingml/2006/picture">
+                <pic:pic xmlns:pic="http://schemas.openxmlformats.org/drawingml/2006/picture">
+                  <pic:nvPicPr>
+                    <pic:cNvPr id="887771258" name=""/>
+                    <pic:cNvPicPr/>
+                  </pic:nvPicPr>
+                  <pic:blipFill>
+                    <a:blip r:embed="rId33"/>
+                    <a:stretch>
+                      <a:fillRect/>
+                    </a:stretch>
+                  </pic:blipFill>
+                  <pic:spPr>
+                    <a:xfrm>
+                      <a:off x="0" y="0"/>
+                      <a:ext cx="4976291" cy="3703641"/>
+                    </a:xfrm>
+                    <a:prstGeom prst="rect">
+                      <a:avLst/>
+                    </a:prstGeom>
+                  </pic:spPr>
+                </pic:pic>
+              </a:graphicData>
+            </a:graphic>
+          </wp:inline>
+        </w:drawing>
+      </w:r>
+    </w:p>
+    <w:p>
+      <w:pPr>
+        <w:jc w:val="center"/>
+      </w:pPr>
+      <w:r>
+        <w:drawing>
+          <wp:inline distT="0" distB="0" distL="0" distR="0" wp14:anchorId="59B9A74B" wp14:editId="552FC249">
+            <wp:extent cx="7052310" cy="2532380"/>
+            <wp:effectExtent l="0" t="0" r="0" b="1270"/>
+            <wp:docPr id="778790343" name="Picture 1"/>
+            <wp:cNvGraphicFramePr>
+              <a:graphicFrameLocks xmlns:a="http://schemas.openxmlformats.org/drawingml/2006/main" noChangeAspect="1"/>
+            </wp:cNvGraphicFramePr>
+            <a:graphic xmlns:a="http://schemas.openxmlformats.org/drawingml/2006/main">
+              <a:graphicData uri="http://schemas.openxmlformats.org/drawingml/2006/picture">
+                <pic:pic xmlns:pic="http://schemas.openxmlformats.org/drawingml/2006/picture">
+                  <pic:nvPicPr>
+                    <pic:cNvPr id="778790343" name=""/>
+                    <pic:cNvPicPr/>
+                  </pic:nvPicPr>
+                  <pic:blipFill>
+                    <a:blip r:embed="rId34"/>
+                    <a:stretch>
+                      <a:fillRect/>
+                    </a:stretch>
+                  </pic:blipFill>
+                  <pic:spPr>
+                    <a:xfrm>
+                      <a:off x="0" y="0"/>
+                      <a:ext cx="7052310" cy="2532380"/>
+                    </a:xfrm>
+                    <a:prstGeom prst="rect">
+                      <a:avLst/>
+                    </a:prstGeom>
+                  </pic:spPr>
+                </pic:pic>
+              </a:graphicData>
+            </a:graphic>
+          </wp:inline>
+        </w:drawing>
+      </w:r>
+    </w:p>
+    <w:p>
+      <w:pPr>
+        <w:jc w:val="center"/>
+      </w:pPr>
+      <w:r>
+        <w:rPr>
+          <w:noProof/>
+        </w:rPr>
+        <w:lastRenderedPageBreak/>
+        <w:drawing>
+          <wp:inline distT="0" distB="0" distL="0" distR="0" wp14:anchorId="68025753" wp14:editId="01E39981">
+            <wp:extent cx="5848350" cy="4391025"/>
+            <wp:effectExtent l="0" t="0" r="0" b="9525"/>
+            <wp:docPr id="976993087" name="Picture 6"/>
+            <wp:cNvGraphicFramePr>
+              <a:graphicFrameLocks xmlns:a="http://schemas.openxmlformats.org/drawingml/2006/main" noChangeAspect="1"/>
+            </wp:cNvGraphicFramePr>
+            <a:graphic xmlns:a="http://schemas.openxmlformats.org/drawingml/2006/main">
+              <a:graphicData uri="http://schemas.openxmlformats.org/drawingml/2006/picture">
+                <pic:pic xmlns:pic="http://schemas.openxmlformats.org/drawingml/2006/picture">
+                  <pic:nvPicPr>
+                    <pic:cNvPr id="0" name="Picture 2"/>
+                    <pic:cNvPicPr>
+                      <a:picLocks noChangeAspect="1" noChangeArrowheads="1"/>
+                    </pic:cNvPicPr>
+                  </pic:nvPicPr>
+                  <pic:blipFill>
+                    <a:blip r:embed="rId35" cstate="print">
+                      <a:extLst>
+                        <a:ext uri="{28A0092B-C50C-407E-A947-70E740481C1C}">
+                          <a14:useLocalDpi xmlns:a14="http://schemas.microsoft.com/office/drawing/2010/main" val="0"/>
+                        </a:ext>
+                      </a:extLst>
+                    </a:blip>
+                    <a:srcRect/>
+                    <a:stretch>
+                      <a:fillRect/>
+                    </a:stretch>
+                  </pic:blipFill>
+                  <pic:spPr bwMode="auto">
+                    <a:xfrm>
+                      <a:off x="0" y="0"/>
+                      <a:ext cx="5848350" cy="4391025"/>
+                    </a:xfrm>
+                    <a:prstGeom prst="rect">
+                      <a:avLst/>
+                    </a:prstGeom>
+                    <a:noFill/>
+                    <a:ln>
+                      <a:noFill/>
+                    </a:ln>
+                  </pic:spPr>
+                </pic:pic>
+              </a:graphicData>
+            </a:graphic>
+          </wp:inline>
+        </w:drawing>
+      </w:r>
+      <w:r>
+        <w:rPr>
+          <w:noProof/>
+        </w:rPr>
+        <w:drawing>
+          <wp:inline distT="0" distB="0" distL="0" distR="0" wp14:anchorId="3CDD0164" wp14:editId="5109D956">
+            <wp:extent cx="7052310" cy="4231640"/>
+            <wp:effectExtent l="0" t="0" r="0" b="0"/>
+            <wp:docPr id="1836821587" name="Picture 5"/>
+            <wp:cNvGraphicFramePr>
+              <a:graphicFrameLocks xmlns:a="http://schemas.openxmlformats.org/drawingml/2006/main" noChangeAspect="1"/>
+            </wp:cNvGraphicFramePr>
+            <a:graphic xmlns:a="http://schemas.openxmlformats.org/drawingml/2006/main">
+              <a:graphicData uri="http://schemas.openxmlformats.org/drawingml/2006/picture">
+                <pic:pic xmlns:pic="http://schemas.openxmlformats.org/drawingml/2006/picture">
+                  <pic:nvPicPr>
+                    <pic:cNvPr id="0" name="Picture 1"/>
+                    <pic:cNvPicPr>
+                      <a:picLocks noChangeAspect="1" noChangeArrowheads="1"/>
+                    </pic:cNvPicPr>
+                  </pic:nvPicPr>
+                  <pic:blipFill>
+                    <a:blip r:embed="rId36" cstate="print">
+                      <a:extLst>
+                        <a:ext uri="{28A0092B-C50C-407E-A947-70E740481C1C}">
+                          <a14:useLocalDpi xmlns:a14="http://schemas.microsoft.com/office/drawing/2010/main" val="0"/>
+                        </a:ext>
+                      </a:extLst>
+                    </a:blip>
+                    <a:srcRect/>
+                    <a:stretch>
+                      <a:fillRect/>
+                    </a:stretch>
+                  </pic:blipFill>
+                  <pic:spPr bwMode="auto">
+                    <a:xfrm>
+                      <a:off x="0" y="0"/>
+                      <a:ext cx="7052310" cy="4231640"/>
+                    </a:xfrm>
+                    <a:prstGeom prst="rect">
+                      <a:avLst/>
+                    </a:prstGeom>
+                    <a:noFill/>
+                    <a:ln>
+                      <a:noFill/>
+                    </a:ln>
+                  </pic:spPr>
+                </pic:pic>
+              </a:graphicData>
+            </a:graphic>
+          </wp:inline>
+        </w:drawing>
+      </w:r>
+    </w:p>
+    <w:p>
+      <w:pPr>
+        <w:jc w:val="center"/>
+      </w:pPr>
+    </w:p>
+    <w:p>
+      <w:r>
+        <w:lastRenderedPageBreak/>
+        <w:drawing>
+          <wp:inline distT="0" distB="0" distL="0" distR="0" wp14:anchorId="505F3C20" wp14:editId="291E0AB0">
+            <wp:extent cx="7052310" cy="3237865"/>
+            <wp:effectExtent l="0" t="0" r="0" b="635"/>
+            <wp:docPr id="2055442621" name="Picture 1"/>
+            <wp:cNvGraphicFramePr>
+              <a:graphicFrameLocks xmlns:a="http://schemas.openxmlformats.org/drawingml/2006/main" noChangeAspect="1"/>
+            </wp:cNvGraphicFramePr>
+            <a:graphic xmlns:a="http://schemas.openxmlformats.org/drawingml/2006/main">
+              <a:graphicData uri="http://schemas.openxmlformats.org/drawingml/2006/picture">
+                <pic:pic xmlns:pic="http://schemas.openxmlformats.org/drawingml/2006/picture">
+                  <pic:nvPicPr>
+                    <pic:cNvPr id="2055442621" name=""/>
+                    <pic:cNvPicPr/>
+                  </pic:nvPicPr>
+                  <pic:blipFill>
+                    <a:blip r:embed="rId37"/>
+                    <a:stretch>
+                      <a:fillRect/>
+                    </a:stretch>
+                  </pic:blipFill>
+                  <pic:spPr>
+                    <a:xfrm>
+                      <a:off x="0" y="0"/>
+                      <a:ext cx="7052310" cy="3237865"/>
+                    </a:xfrm>
+                    <a:prstGeom prst="rect">
+                      <a:avLst/>
+                    </a:prstGeom>
+                  </pic:spPr>
+                </pic:pic>
+              </a:graphicData>
+            </a:graphic>
+          </wp:inline>
+        </w:drawing>
+      </w:r>
+    </w:p>
     <w:p/>
     <w:sectPr>
       <w:pgSz w:w="12240" w:h="15840"/>

</xml_diff>

<commit_message>
Update lại code, xử lý các note cô đã góp ý
</commit_message>
<xml_diff>
--- a/All_infomation_by_NTAnh.docx
+++ b/All_infomation_by_NTAnh.docx
@@ -16,6 +16,9 @@
     </w:p>
     <w:p>
       <w:r>
+        <w:rPr>
+          <w:noProof/>
+        </w:rPr>
         <w:drawing>
           <wp:inline distT="0" distB="0" distL="0" distR="0" wp14:anchorId="4D204DBE" wp14:editId="6B5361D0">
             <wp:extent cx="5524979" cy="2568163"/>
@@ -300,6 +303,9 @@
         <w:jc w:val="center"/>
       </w:pPr>
       <w:r>
+        <w:rPr>
+          <w:noProof/>
+        </w:rPr>
         <w:lastRenderedPageBreak/>
         <w:drawing>
           <wp:inline distT="0" distB="0" distL="0" distR="0" wp14:anchorId="06D4D45A" wp14:editId="2DE327A9">
@@ -459,6 +465,9 @@
     </w:p>
     <w:p>
       <w:r>
+        <w:rPr>
+          <w:noProof/>
+        </w:rPr>
         <w:drawing>
           <wp:inline distT="0" distB="0" distL="0" distR="0" wp14:anchorId="015900F2" wp14:editId="4E85E2C9">
             <wp:extent cx="3162574" cy="2491956"/>
@@ -514,6 +523,9 @@
         <w:jc w:val="center"/>
       </w:pPr>
       <w:r>
+        <w:rPr>
+          <w:noProof/>
+        </w:rPr>
         <w:lastRenderedPageBreak/>
         <w:drawing>
           <wp:inline distT="0" distB="0" distL="0" distR="0" wp14:anchorId="31BAE46D" wp14:editId="0C76B1BE">
@@ -593,6 +605,9 @@
         <w:jc w:val="center"/>
       </w:pPr>
       <w:r>
+        <w:rPr>
+          <w:noProof/>
+        </w:rPr>
         <w:lastRenderedPageBreak/>
         <w:drawing>
           <wp:inline distT="0" distB="0" distL="0" distR="0" wp14:anchorId="7F6F6682" wp14:editId="211EAF39">
@@ -636,6 +651,9 @@
         <w:jc w:val="center"/>
       </w:pPr>
       <w:r>
+        <w:rPr>
+          <w:noProof/>
+        </w:rPr>
         <w:drawing>
           <wp:inline distT="0" distB="0" distL="0" distR="0" wp14:anchorId="624A2C20" wp14:editId="528BBC10">
             <wp:extent cx="5357324" cy="5243014"/>
@@ -684,6 +702,9 @@
         <w:jc w:val="center"/>
       </w:pPr>
       <w:r>
+        <w:rPr>
+          <w:noProof/>
+        </w:rPr>
         <w:lastRenderedPageBreak/>
         <w:drawing>
           <wp:inline distT="0" distB="0" distL="0" distR="0" wp14:anchorId="4FE54565" wp14:editId="29A41852">
@@ -757,6 +778,9 @@
         <w:jc w:val="center"/>
       </w:pPr>
       <w:r>
+        <w:rPr>
+          <w:noProof/>
+        </w:rPr>
         <w:drawing>
           <wp:inline distT="0" distB="0" distL="0" distR="0" wp14:anchorId="7F30866A" wp14:editId="20BF6EAA">
             <wp:extent cx="7052310" cy="3963670"/>
@@ -799,6 +823,9 @@
         <w:jc w:val="center"/>
       </w:pPr>
       <w:r>
+        <w:rPr>
+          <w:noProof/>
+        </w:rPr>
         <w:lastRenderedPageBreak/>
         <w:drawing>
           <wp:inline distT="0" distB="0" distL="0" distR="0" wp14:anchorId="354733C9" wp14:editId="079A66B0">
@@ -842,6 +869,9 @@
         <w:jc w:val="center"/>
       </w:pPr>
       <w:r>
+        <w:rPr>
+          <w:noProof/>
+        </w:rPr>
         <w:drawing>
           <wp:inline distT="0" distB="0" distL="0" distR="0" wp14:anchorId="3F04C4C7" wp14:editId="7BAE3A40">
             <wp:extent cx="7052310" cy="4071620"/>
@@ -889,6 +919,9 @@
         <w:jc w:val="center"/>
       </w:pPr>
       <w:r>
+        <w:rPr>
+          <w:noProof/>
+        </w:rPr>
         <w:lastRenderedPageBreak/>
         <w:drawing>
           <wp:inline distT="0" distB="0" distL="0" distR="0" wp14:anchorId="14873F6A" wp14:editId="23988E91">
@@ -932,6 +965,9 @@
         <w:jc w:val="center"/>
       </w:pPr>
       <w:r>
+        <w:rPr>
+          <w:noProof/>
+        </w:rPr>
         <w:drawing>
           <wp:inline distT="0" distB="0" distL="0" distR="0" wp14:anchorId="750E7662" wp14:editId="46E081F7">
             <wp:extent cx="5044877" cy="3033023"/>
@@ -979,6 +1015,9 @@
         <w:jc w:val="center"/>
       </w:pPr>
       <w:r>
+        <w:rPr>
+          <w:noProof/>
+        </w:rPr>
         <w:lastRenderedPageBreak/>
         <w:drawing>
           <wp:inline distT="0" distB="0" distL="0" distR="0" wp14:anchorId="0FBA9A58" wp14:editId="04BFE82E">
@@ -1035,6 +1074,9 @@
         <w:jc w:val="center"/>
       </w:pPr>
       <w:r>
+        <w:rPr>
+          <w:noProof/>
+        </w:rPr>
         <w:drawing>
           <wp:inline distT="0" distB="0" distL="0" distR="0" wp14:anchorId="301B89F8" wp14:editId="7601BBE6">
             <wp:extent cx="7052310" cy="3757930"/>
@@ -1077,6 +1119,9 @@
         <w:jc w:val="center"/>
       </w:pPr>
       <w:r>
+        <w:rPr>
+          <w:noProof/>
+        </w:rPr>
         <w:drawing>
           <wp:inline distT="0" distB="0" distL="0" distR="0" wp14:anchorId="5CC6979F" wp14:editId="2C37B63C">
             <wp:extent cx="7052310" cy="1193800"/>
@@ -1124,6 +1169,9 @@
         <w:jc w:val="center"/>
       </w:pPr>
       <w:r>
+        <w:rPr>
+          <w:noProof/>
+        </w:rPr>
         <w:lastRenderedPageBreak/>
         <w:drawing>
           <wp:inline distT="0" distB="0" distL="0" distR="0" wp14:anchorId="7E4DDBD2" wp14:editId="0BF6F630">
@@ -1167,6 +1215,9 @@
         <w:jc w:val="center"/>
       </w:pPr>
       <w:r>
+        <w:rPr>
+          <w:noProof/>
+        </w:rPr>
         <w:drawing>
           <wp:inline distT="0" distB="0" distL="0" distR="0" wp14:anchorId="3CF34246" wp14:editId="5B424940">
             <wp:extent cx="4701947" cy="1371719"/>
@@ -1214,6 +1265,9 @@
         <w:jc w:val="center"/>
       </w:pPr>
       <w:r>
+        <w:rPr>
+          <w:noProof/>
+        </w:rPr>
         <w:drawing>
           <wp:inline distT="0" distB="0" distL="0" distR="0" wp14:anchorId="0A09FDEA" wp14:editId="3C5EB294">
             <wp:extent cx="5197290" cy="2644369"/>
@@ -1261,6 +1315,9 @@
         <w:jc w:val="center"/>
       </w:pPr>
       <w:r>
+        <w:rPr>
+          <w:noProof/>
+        </w:rPr>
         <w:lastRenderedPageBreak/>
         <w:drawing>
           <wp:inline distT="0" distB="0" distL="0" distR="0" wp14:anchorId="7B6EF0DE" wp14:editId="6A1B6005">
@@ -1304,6 +1361,9 @@
         <w:jc w:val="center"/>
       </w:pPr>
       <w:r>
+        <w:rPr>
+          <w:noProof/>
+        </w:rPr>
         <w:drawing>
           <wp:inline distT="0" distB="0" distL="0" distR="0" wp14:anchorId="11FCCFAB" wp14:editId="2AB78639">
             <wp:extent cx="4884843" cy="1691787"/>
@@ -1353,6 +1413,9 @@
         <w:jc w:val="center"/>
       </w:pPr>
       <w:r>
+        <w:rPr>
+          <w:noProof/>
+        </w:rPr>
         <w:lastRenderedPageBreak/>
         <w:drawing>
           <wp:inline distT="0" distB="0" distL="0" distR="0" wp14:anchorId="409E16E7" wp14:editId="0F413BE7">
@@ -1405,6 +1468,9 @@
         <w:jc w:val="center"/>
       </w:pPr>
       <w:r>
+        <w:rPr>
+          <w:noProof/>
+        </w:rPr>
         <w:drawing>
           <wp:inline distT="0" distB="0" distL="0" distR="0" wp14:anchorId="0BC6C632" wp14:editId="63AE19A5">
             <wp:extent cx="4633362" cy="1356478"/>
@@ -1452,6 +1518,9 @@
         <w:jc w:val="center"/>
       </w:pPr>
       <w:r>
+        <w:rPr>
+          <w:noProof/>
+        </w:rPr>
         <w:lastRenderedPageBreak/>
         <w:drawing>
           <wp:inline distT="0" distB="0" distL="0" distR="0" wp14:anchorId="47B3672A" wp14:editId="4889A29B">
@@ -1495,6 +1564,9 @@
         <w:jc w:val="center"/>
       </w:pPr>
       <w:r>
+        <w:rPr>
+          <w:noProof/>
+        </w:rPr>
         <w:drawing>
           <wp:inline distT="0" distB="0" distL="0" distR="0" wp14:anchorId="6A9E5176" wp14:editId="56A80EA8">
             <wp:extent cx="5182049" cy="2423370"/>
@@ -1542,6 +1614,9 @@
         <w:jc w:val="center"/>
       </w:pPr>
       <w:r>
+        <w:rPr>
+          <w:noProof/>
+        </w:rPr>
         <w:drawing>
           <wp:inline distT="0" distB="0" distL="0" distR="0" wp14:anchorId="11141F3C" wp14:editId="4BFEF2C6">
             <wp:extent cx="5014395" cy="2110923"/>
@@ -1584,6 +1659,9 @@
         <w:jc w:val="center"/>
       </w:pPr>
       <w:r>
+        <w:rPr>
+          <w:noProof/>
+        </w:rPr>
         <w:lastRenderedPageBreak/>
         <w:drawing>
           <wp:inline distT="0" distB="0" distL="0" distR="0" wp14:anchorId="1AE2A82A" wp14:editId="045A1EF0">
@@ -1627,6 +1705,9 @@
         <w:jc w:val="center"/>
       </w:pPr>
       <w:r>
+        <w:rPr>
+          <w:noProof/>
+        </w:rPr>
         <w:drawing>
           <wp:inline distT="0" distB="0" distL="0" distR="0" wp14:anchorId="59B9A74B" wp14:editId="552FC249">
             <wp:extent cx="7052310" cy="2532380"/>
@@ -1785,18 +1866,18 @@
       <w:r>
         <w:lastRenderedPageBreak/>
         <w:drawing>
-          <wp:inline distT="0" distB="0" distL="0" distR="0" wp14:anchorId="505F3C20" wp14:editId="291E0AB0">
-            <wp:extent cx="7052310" cy="3237865"/>
-            <wp:effectExtent l="0" t="0" r="0" b="635"/>
-            <wp:docPr id="2055442621" name="Picture 1"/>
-            <wp:cNvGraphicFramePr>
-              <a:graphicFrameLocks xmlns:a="http://schemas.openxmlformats.org/drawingml/2006/main" noChangeAspect="1"/>
-            </wp:cNvGraphicFramePr>
-            <a:graphic xmlns:a="http://schemas.openxmlformats.org/drawingml/2006/main">
-              <a:graphicData uri="http://schemas.openxmlformats.org/drawingml/2006/picture">
-                <pic:pic xmlns:pic="http://schemas.openxmlformats.org/drawingml/2006/picture">
-                  <pic:nvPicPr>
-                    <pic:cNvPr id="2055442621" name=""/>
+          <wp:inline distT="0" distB="0" distL="0" distR="0" wp14:anchorId="0A82D5F1" wp14:editId="2F121C54">
+            <wp:extent cx="7052310" cy="3272155"/>
+            <wp:effectExtent l="0" t="0" r="0" b="4445"/>
+            <wp:docPr id="1912615939" name="Picture 1"/>
+            <wp:cNvGraphicFramePr>
+              <a:graphicFrameLocks xmlns:a="http://schemas.openxmlformats.org/drawingml/2006/main" noChangeAspect="1"/>
+            </wp:cNvGraphicFramePr>
+            <a:graphic xmlns:a="http://schemas.openxmlformats.org/drawingml/2006/main">
+              <a:graphicData uri="http://schemas.openxmlformats.org/drawingml/2006/picture">
+                <pic:pic xmlns:pic="http://schemas.openxmlformats.org/drawingml/2006/picture">
+                  <pic:nvPicPr>
+                    <pic:cNvPr id="1912615939" name=""/>
                     <pic:cNvPicPr/>
                   </pic:nvPicPr>
                   <pic:blipFill>
@@ -1808,7 +1889,86 @@
                   <pic:spPr>
                     <a:xfrm>
                       <a:off x="0" y="0"/>
-                      <a:ext cx="7052310" cy="3237865"/>
+                      <a:ext cx="7052310" cy="3272155"/>
+                    </a:xfrm>
+                    <a:prstGeom prst="rect">
+                      <a:avLst/>
+                    </a:prstGeom>
+                  </pic:spPr>
+                </pic:pic>
+              </a:graphicData>
+            </a:graphic>
+          </wp:inline>
+        </w:drawing>
+      </w:r>
+    </w:p>
+    <w:p>
+      <w:r>
+        <w:drawing>
+          <wp:inline distT="0" distB="0" distL="0" distR="0" wp14:anchorId="2A6E3605" wp14:editId="4D90E13A">
+            <wp:extent cx="7052310" cy="3221355"/>
+            <wp:effectExtent l="0" t="0" r="0" b="0"/>
+            <wp:docPr id="172804921" name="Picture 1"/>
+            <wp:cNvGraphicFramePr>
+              <a:graphicFrameLocks xmlns:a="http://schemas.openxmlformats.org/drawingml/2006/main" noChangeAspect="1"/>
+            </wp:cNvGraphicFramePr>
+            <a:graphic xmlns:a="http://schemas.openxmlformats.org/drawingml/2006/main">
+              <a:graphicData uri="http://schemas.openxmlformats.org/drawingml/2006/picture">
+                <pic:pic xmlns:pic="http://schemas.openxmlformats.org/drawingml/2006/picture">
+                  <pic:nvPicPr>
+                    <pic:cNvPr id="172804921" name=""/>
+                    <pic:cNvPicPr/>
+                  </pic:nvPicPr>
+                  <pic:blipFill>
+                    <a:blip r:embed="rId39"/>
+                    <a:stretch>
+                      <a:fillRect/>
+                    </a:stretch>
+                  </pic:blipFill>
+                  <pic:spPr>
+                    <a:xfrm>
+                      <a:off x="0" y="0"/>
+                      <a:ext cx="7052310" cy="3221355"/>
+                    </a:xfrm>
+                    <a:prstGeom prst="rect">
+                      <a:avLst/>
+                    </a:prstGeom>
+                  </pic:spPr>
+                </pic:pic>
+              </a:graphicData>
+            </a:graphic>
+          </wp:inline>
+        </w:drawing>
+      </w:r>
+    </w:p>
+    <w:p>
+      <w:r>
+        <w:lastRenderedPageBreak/>
+        <w:drawing>
+          <wp:inline distT="0" distB="0" distL="0" distR="0" wp14:anchorId="0E74CFC7" wp14:editId="094E7BB9">
+            <wp:extent cx="7052310" cy="3236595"/>
+            <wp:effectExtent l="0" t="0" r="0" b="1905"/>
+            <wp:docPr id="1495990648" name="Picture 1"/>
+            <wp:cNvGraphicFramePr>
+              <a:graphicFrameLocks xmlns:a="http://schemas.openxmlformats.org/drawingml/2006/main" noChangeAspect="1"/>
+            </wp:cNvGraphicFramePr>
+            <a:graphic xmlns:a="http://schemas.openxmlformats.org/drawingml/2006/main">
+              <a:graphicData uri="http://schemas.openxmlformats.org/drawingml/2006/picture">
+                <pic:pic xmlns:pic="http://schemas.openxmlformats.org/drawingml/2006/picture">
+                  <pic:nvPicPr>
+                    <pic:cNvPr id="1495990648" name=""/>
+                    <pic:cNvPicPr/>
+                  </pic:nvPicPr>
+                  <pic:blipFill>
+                    <a:blip r:embed="rId40"/>
+                    <a:stretch>
+                      <a:fillRect/>
+                    </a:stretch>
+                  </pic:blipFill>
+                  <pic:spPr>
+                    <a:xfrm>
+                      <a:off x="0" y="0"/>
+                      <a:ext cx="7052310" cy="3236595"/>
                     </a:xfrm>
                     <a:prstGeom prst="rect">
                       <a:avLst/>
@@ -2434,6 +2594,7 @@
   <w:style w:type="character" w:default="1" w:styleId="DefaultParagraphFont">
     <w:name w:val="Default Paragraph Font"/>
     <w:uiPriority w:val="1"/>
+    <w:semiHidden/>
     <w:unhideWhenUsed/>
   </w:style>
   <w:style w:type="table" w:default="1" w:styleId="TableNormal">

</xml_diff>